<commit_message>
feat(db): Step I.0d migration 0006 - remove pregnancy, lactation and kidney disease (#167)
- Drop user_profiles.physiological_status and its two CHECKs (migration 0006)
- Screening keeps UNDER_18 and unsupported conditions (DIABETES_INSULIN)
- Remove CKD from catalog, F.1 slice and mini reference seeds; loaders delete conditions missing from the seed
- F.1 persona P3 now uses DIABETES_INSULIN; report changed in P3 lines only
- catalog_scenario_report P3 lines edited by hand (--catalog mode cannot run on the catalog-only dev DB; fix in I.4)
- PROJECT_CONTEXT v4.20, DEV_JOURNAL J-037, docs and UI prototype cleaned
</commit_message>
<xml_diff>
--- a/docs/project/report/chapters/NutriGuideAI_Abstract_Ch1_Ch2.docx
+++ b/docs/project/report/chapters/NutriGuideAI_Abstract_Ch1_Ch2.docx
@@ -6,14 +6,15 @@
       <w:pPr>
         <w:pStyle w:val="Heading1"/>
         <w:bidi/>
+        <w:jc w:val="right"/>
       </w:pPr>
       <w:r>
         <w:rPr>
           <w:rFonts w:ascii="Simplified Arabic" w:hAnsi="Simplified Arabic" w:cs="Simplified Arabic" w:eastAsia="Simplified Arabic"/>
           <w:b/>
-          <w:bCs/>
           <w:i w:val="0"/>
           <w:sz w:val="40"/>
+          <w:bCs/>
           <w:szCs w:val="40"/>
           <w:rtl/>
         </w:rPr>
@@ -58,13 +59,12 @@
       <w:pPr>
         <w:sectPr>
           <w:footerReference w:type="default" r:id="rId9"/>
-          <w:headerReference w:type="default" r:id="rId14"/>
           <w:pgSz w:w="11906" w:h="16838"/>
           <w:pgMar w:top="1417" w:right="1701" w:bottom="1417" w:left="1134" w:header="720" w:footer="720" w:gutter="0"/>
+          <w:cols w:space="720"/>
+          <w:docGrid w:linePitch="360"/>
           <w:pgNumType w:fmt="upperRoman" w:start="2"/>
-          <w:cols w:space="720"/>
           <w:bidi/>
-          <w:docGrid w:linePitch="360"/>
         </w:sectPr>
       </w:pPr>
     </w:p>
@@ -78,9 +78,9 @@
         <w:rPr>
           <w:rFonts w:ascii="Times New Roman" w:hAnsi="Times New Roman" w:cs="Times New Roman" w:eastAsia="Times New Roman"/>
           <w:b/>
-          <w:bCs/>
           <w:i w:val="0"/>
           <w:sz w:val="36"/>
+          <w:bCs/>
           <w:szCs w:val="36"/>
         </w:rPr>
         <w:t>Abstract</w:t>
@@ -124,10 +124,10 @@
           <w:footerReference w:type="default" r:id="rId10"/>
           <w:pgSz w:w="11906" w:h="16838"/>
           <w:pgMar w:top="1417" w:right="1134" w:bottom="1417" w:left="1701" w:header="720" w:footer="720" w:gutter="0"/>
+          <w:cols w:space="720"/>
+          <w:docGrid w:linePitch="360"/>
+          <w:bidi/>
           <w:pgNumType w:fmt="upperRoman"/>
-          <w:cols w:space="720"/>
-          <w:bidi/>
-          <w:docGrid w:linePitch="360"/>
         </w:sectPr>
       </w:pPr>
     </w:p>
@@ -197,9 +197,9 @@
         <w:rPr>
           <w:rFonts w:ascii="Simplified Arabic" w:hAnsi="Simplified Arabic" w:cs="Simplified Arabic" w:eastAsia="Simplified Arabic"/>
           <w:b/>
-          <w:bCs/>
           <w:i w:val="0"/>
           <w:sz w:val="56"/>
+          <w:bCs/>
           <w:szCs w:val="56"/>
           <w:rtl/>
         </w:rPr>
@@ -212,9 +212,9 @@
         <w:rPr>
           <w:rFonts w:ascii="Simplified Arabic" w:hAnsi="Simplified Arabic" w:cs="Simplified Arabic" w:eastAsia="Simplified Arabic"/>
           <w:b/>
-          <w:bCs/>
           <w:i w:val="0"/>
           <w:sz w:val="56"/>
+          <w:bCs/>
           <w:szCs w:val="56"/>
           <w:rtl/>
         </w:rPr>
@@ -230,14 +230,15 @@
       <w:pPr>
         <w:pStyle w:val="Heading2"/>
         <w:bidi/>
+        <w:jc w:val="right"/>
       </w:pPr>
       <w:r>
         <w:rPr>
           <w:rFonts w:ascii="Simplified Arabic" w:hAnsi="Simplified Arabic" w:cs="Simplified Arabic" w:eastAsia="Simplified Arabic"/>
           <w:b/>
-          <w:bCs/>
           <w:i w:val="0"/>
           <w:sz w:val="32"/>
+          <w:bCs/>
           <w:szCs w:val="32"/>
           <w:rtl/>
         </w:rPr>
@@ -421,14 +422,15 @@
       <w:pPr>
         <w:pStyle w:val="Heading2"/>
         <w:bidi/>
+        <w:jc w:val="right"/>
       </w:pPr>
       <w:r>
         <w:rPr>
           <w:rFonts w:ascii="Simplified Arabic" w:hAnsi="Simplified Arabic" w:cs="Simplified Arabic" w:eastAsia="Simplified Arabic"/>
           <w:b/>
-          <w:bCs/>
           <w:i w:val="0"/>
           <w:sz w:val="32"/>
+          <w:bCs/>
           <w:szCs w:val="32"/>
           <w:rtl/>
         </w:rPr>
@@ -461,9 +463,9 @@
         <w:rPr>
           <w:rFonts w:ascii="Simplified Arabic" w:hAnsi="Simplified Arabic" w:cs="Simplified Arabic" w:eastAsia="Simplified Arabic"/>
           <w:b/>
-          <w:bCs/>
           <w:i w:val="0"/>
           <w:sz w:val="28"/>
+          <w:bCs/>
           <w:szCs w:val="28"/>
           <w:rtl/>
         </w:rPr>
@@ -490,9 +492,9 @@
         <w:rPr>
           <w:rFonts w:ascii="Simplified Arabic" w:hAnsi="Simplified Arabic" w:cs="Simplified Arabic" w:eastAsia="Simplified Arabic"/>
           <w:b/>
-          <w:bCs/>
           <w:i w:val="0"/>
           <w:sz w:val="28"/>
+          <w:bCs/>
           <w:szCs w:val="28"/>
           <w:rtl/>
         </w:rPr>
@@ -519,9 +521,9 @@
         <w:rPr>
           <w:rFonts w:ascii="Simplified Arabic" w:hAnsi="Simplified Arabic" w:cs="Simplified Arabic" w:eastAsia="Simplified Arabic"/>
           <w:b/>
-          <w:bCs/>
           <w:i w:val="0"/>
           <w:sz w:val="28"/>
+          <w:bCs/>
           <w:szCs w:val="28"/>
           <w:rtl/>
         </w:rPr>
@@ -559,9 +561,9 @@
         <w:rPr>
           <w:rFonts w:ascii="Simplified Arabic" w:hAnsi="Simplified Arabic" w:cs="Simplified Arabic" w:eastAsia="Simplified Arabic"/>
           <w:b/>
-          <w:bCs/>
           <w:i w:val="0"/>
           <w:sz w:val="28"/>
+          <w:bCs/>
           <w:szCs w:val="28"/>
           <w:rtl/>
         </w:rPr>
@@ -572,14 +574,15 @@
       <w:pPr>
         <w:pStyle w:val="Heading2"/>
         <w:bidi/>
+        <w:jc w:val="right"/>
       </w:pPr>
       <w:r>
         <w:rPr>
           <w:rFonts w:ascii="Simplified Arabic" w:hAnsi="Simplified Arabic" w:cs="Simplified Arabic" w:eastAsia="Simplified Arabic"/>
           <w:b/>
-          <w:bCs/>
           <w:i w:val="0"/>
           <w:sz w:val="32"/>
+          <w:bCs/>
           <w:szCs w:val="32"/>
           <w:rtl/>
         </w:rPr>
@@ -757,14 +760,15 @@
       <w:pPr>
         <w:pStyle w:val="Heading2"/>
         <w:bidi/>
+        <w:jc w:val="right"/>
       </w:pPr>
       <w:r>
         <w:rPr>
           <w:rFonts w:ascii="Simplified Arabic" w:hAnsi="Simplified Arabic" w:cs="Simplified Arabic" w:eastAsia="Simplified Arabic"/>
           <w:b/>
-          <w:bCs/>
           <w:i w:val="0"/>
           <w:sz w:val="32"/>
+          <w:bCs/>
           <w:szCs w:val="32"/>
           <w:rtl/>
         </w:rPr>
@@ -798,9 +802,9 @@
         <w:rPr>
           <w:rFonts w:ascii="Simplified Arabic" w:hAnsi="Simplified Arabic" w:cs="Simplified Arabic" w:eastAsia="Simplified Arabic"/>
           <w:b/>
-          <w:bCs/>
           <w:i w:val="0"/>
           <w:sz w:val="28"/>
+          <w:bCs/>
           <w:szCs w:val="28"/>
           <w:rtl/>
         </w:rPr>
@@ -828,9 +832,9 @@
         <w:rPr>
           <w:rFonts w:ascii="Simplified Arabic" w:hAnsi="Simplified Arabic" w:cs="Simplified Arabic" w:eastAsia="Simplified Arabic"/>
           <w:b/>
-          <w:bCs/>
           <w:i w:val="0"/>
           <w:sz w:val="28"/>
+          <w:bCs/>
           <w:szCs w:val="28"/>
           <w:rtl/>
         </w:rPr>
@@ -852,14 +856,15 @@
       <w:pPr>
         <w:pStyle w:val="Heading2"/>
         <w:bidi/>
+        <w:jc w:val="right"/>
       </w:pPr>
       <w:r>
         <w:rPr>
           <w:rFonts w:ascii="Simplified Arabic" w:hAnsi="Simplified Arabic" w:cs="Simplified Arabic" w:eastAsia="Simplified Arabic"/>
           <w:b/>
-          <w:bCs/>
           <w:i w:val="0"/>
           <w:sz w:val="32"/>
+          <w:bCs/>
           <w:szCs w:val="32"/>
           <w:rtl/>
         </w:rPr>
@@ -870,14 +875,15 @@
       <w:pPr>
         <w:pStyle w:val="Heading3"/>
         <w:bidi/>
+        <w:jc w:val="right"/>
       </w:pPr>
       <w:r>
         <w:rPr>
           <w:rFonts w:ascii="Simplified Arabic" w:hAnsi="Simplified Arabic" w:cs="Simplified Arabic" w:eastAsia="Simplified Arabic"/>
           <w:b/>
-          <w:bCs/>
           <w:i w:val="0"/>
           <w:sz w:val="28"/>
+          <w:bCs/>
           <w:szCs w:val="28"/>
           <w:rtl/>
         </w:rPr>
@@ -1014,14 +1020,15 @@
       <w:pPr>
         <w:pStyle w:val="Heading3"/>
         <w:bidi/>
+        <w:jc w:val="right"/>
       </w:pPr>
       <w:r>
         <w:rPr>
           <w:rFonts w:ascii="Simplified Arabic" w:hAnsi="Simplified Arabic" w:cs="Simplified Arabic" w:eastAsia="Simplified Arabic"/>
           <w:b/>
-          <w:bCs/>
           <w:i w:val="0"/>
           <w:sz w:val="28"/>
+          <w:bCs/>
           <w:szCs w:val="28"/>
           <w:rtl/>
         </w:rPr>
@@ -1038,9 +1045,9 @@
         <w:rPr>
           <w:rFonts w:ascii="Simplified Arabic" w:hAnsi="Simplified Arabic" w:cs="Simplified Arabic" w:eastAsia="Simplified Arabic"/>
           <w:b/>
-          <w:bCs/>
           <w:i w:val="0"/>
           <w:sz w:val="28"/>
+          <w:bCs/>
           <w:szCs w:val="28"/>
           <w:rtl/>
         </w:rPr>
@@ -1055,7 +1062,7 @@
           <w:szCs w:val="28"/>
           <w:rtl/>
         </w:rPr>
-        <w:t xml:space="preserve"> يقدم التطبيق اقتراحات غذائية ولا يغني عن الطبيب أو أخصائي التغذية. ولا يقدم خطة سعرات شخصية لمن هم دون 18 سنة، ولا للحامل والمرضع، ولا لمرضى الكلى، ولا لمن يستخدم الإنسولين، لأن معادلات الاحتياج المستخدمة لا تغطي هذه الحالات. ويستطيع هؤلاء استخدام التطبيق في «الوضع العام» لتصفح الوجبات وتسجيل الأكل والماء، مع نصيحة بمراجعة مختص.</w:t>
+        <w:t xml:space="preserve"> يقدم التطبيق اقتراحات غذائية ولا يغني عن الطبيب أو أخصائي التغذية. ولا يقدم خطة سعرات شخصية لمن هم دون 18 سنة، ولا لمن يستخدم الإنسولين، لأن معادلات الاحتياج المستخدمة لا تغطي هاتين الحالتين. ويستطيع هؤلاء استخدام التطبيق في «الوضع العام» لتصفح الوجبات وتسجيل الأكل والماء، مع نصيحة بمراجعة مختص.</w:t>
       </w:r>
     </w:p>
     <w:p>
@@ -1068,13 +1075,13 @@
         <w:rPr>
           <w:rFonts w:ascii="Simplified Arabic" w:hAnsi="Simplified Arabic" w:cs="Simplified Arabic" w:eastAsia="Simplified Arabic"/>
           <w:b/>
-          <w:bCs/>
           <w:i w:val="0"/>
           <w:sz w:val="28"/>
+          <w:bCs/>
           <w:szCs w:val="28"/>
           <w:rtl/>
         </w:rPr>
-        <w:t>استبعاد النقرس:</w:t>
+        <w:t>الفئة المستهدفة:</w:t>
       </w:r>
       <w:r>
         <w:rPr>
@@ -1085,7 +1092,7 @@
           <w:szCs w:val="28"/>
           <w:rtl/>
         </w:rPr>
-        <w:t xml:space="preserve"> دعم النقرس يحتاج إلى بيانات موثوقة عن محتوى البيورين في الأطعمة، وهذه غير متوفرة في المصدر الغذائي المستخدم، لذلك استُبعد من نطاق المشروع.</w:t>
+        <w:t xml:space="preserve"> صُمم التطبيق للبالغين المصابين بالسكري من النوع الثاني أو ارتفاع ضغط الدم أو أمراض القلب، أو بلا مرض، وليس للحمل أو الرضاعة أو أمراض الكلى أو النقرس.</w:t>
       </w:r>
     </w:p>
     <w:p>
@@ -1098,9 +1105,9 @@
         <w:rPr>
           <w:rFonts w:ascii="Simplified Arabic" w:hAnsi="Simplified Arabic" w:cs="Simplified Arabic" w:eastAsia="Simplified Arabic"/>
           <w:b/>
-          <w:bCs/>
           <w:i w:val="0"/>
           <w:sz w:val="28"/>
+          <w:bCs/>
           <w:szCs w:val="28"/>
           <w:rtl/>
         </w:rPr>
@@ -1128,9 +1135,9 @@
         <w:rPr>
           <w:rFonts w:ascii="Simplified Arabic" w:hAnsi="Simplified Arabic" w:cs="Simplified Arabic" w:eastAsia="Simplified Arabic"/>
           <w:b/>
-          <w:bCs/>
           <w:i w:val="0"/>
           <w:sz w:val="28"/>
+          <w:bCs/>
           <w:szCs w:val="28"/>
           <w:rtl/>
         </w:rPr>
@@ -1158,9 +1165,9 @@
         <w:rPr>
           <w:rFonts w:ascii="Simplified Arabic" w:hAnsi="Simplified Arabic" w:cs="Simplified Arabic" w:eastAsia="Simplified Arabic"/>
           <w:b/>
-          <w:bCs/>
           <w:i w:val="0"/>
           <w:sz w:val="28"/>
+          <w:bCs/>
           <w:szCs w:val="28"/>
           <w:rtl/>
         </w:rPr>
@@ -1188,9 +1195,9 @@
         <w:rPr>
           <w:rFonts w:ascii="Simplified Arabic" w:hAnsi="Simplified Arabic" w:cs="Simplified Arabic" w:eastAsia="Simplified Arabic"/>
           <w:b/>
-          <w:bCs/>
           <w:i w:val="0"/>
           <w:sz w:val="28"/>
+          <w:bCs/>
           <w:szCs w:val="28"/>
           <w:rtl/>
         </w:rPr>
@@ -1212,14 +1219,15 @@
       <w:pPr>
         <w:pStyle w:val="Heading2"/>
         <w:bidi/>
+        <w:jc w:val="right"/>
       </w:pPr>
       <w:r>
         <w:rPr>
           <w:rFonts w:ascii="Simplified Arabic" w:hAnsi="Simplified Arabic" w:cs="Simplified Arabic" w:eastAsia="Simplified Arabic"/>
           <w:b/>
-          <w:bCs/>
           <w:i w:val="0"/>
           <w:sz w:val="32"/>
+          <w:bCs/>
           <w:szCs w:val="32"/>
           <w:rtl/>
         </w:rPr>
@@ -1253,9 +1261,9 @@
         <w:rPr>
           <w:rFonts w:ascii="Simplified Arabic" w:hAnsi="Simplified Arabic" w:cs="Simplified Arabic" w:eastAsia="Simplified Arabic"/>
           <w:b/>
-          <w:bCs/>
           <w:i w:val="0"/>
           <w:sz w:val="24"/>
+          <w:bCs/>
           <w:szCs w:val="24"/>
           <w:rtl/>
         </w:rPr>
@@ -1265,11 +1273,11 @@
     <w:tbl>
       <w:tblPr>
         <w:tblStyle w:val="TableGrid"/>
-        <w:bidiVisual/>
         <w:tblW w:type="auto" w:w="0"/>
         <w:jc w:val="center"/>
         <w:tblLayout w:type="fixed"/>
         <w:tblLook w:firstColumn="1" w:firstRow="1" w:lastColumn="0" w:lastRow="0" w:noHBand="0" w:noVBand="1" w:val="04A0"/>
+        <w:bidiVisual/>
       </w:tblPr>
       <w:tblGrid>
         <w:gridCol w:w="2268"/>
@@ -1287,6 +1295,7 @@
             <w:pPr>
               <w:bidi/>
               <w:spacing w:line="240" w:lineRule="auto" w:after="40"/>
+              <w:jc w:val="right"/>
             </w:pPr>
             <w:r>
               <w:rPr>
@@ -1310,6 +1319,7 @@
             <w:pPr>
               <w:bidi/>
               <w:spacing w:line="240" w:lineRule="auto" w:after="40"/>
+              <w:jc w:val="right"/>
             </w:pPr>
             <w:r>
               <w:rPr>
@@ -1333,6 +1343,7 @@
             <w:pPr>
               <w:bidi/>
               <w:spacing w:line="240" w:lineRule="auto" w:after="40"/>
+              <w:jc w:val="right"/>
             </w:pPr>
             <w:r>
               <w:rPr>
@@ -1356,6 +1367,7 @@
             <w:pPr>
               <w:bidi/>
               <w:spacing w:line="240" w:lineRule="auto" w:after="40"/>
+              <w:jc w:val="right"/>
             </w:pPr>
             <w:r>
               <w:rPr>
@@ -1380,6 +1392,7 @@
             <w:pPr>
               <w:bidi/>
               <w:spacing w:line="240" w:lineRule="auto" w:after="40"/>
+              <w:jc w:val="right"/>
             </w:pPr>
             <w:r>
               <w:rPr>
@@ -1402,6 +1415,7 @@
             <w:pPr>
               <w:bidi/>
               <w:spacing w:line="240" w:lineRule="auto" w:after="40"/>
+              <w:jc w:val="right"/>
             </w:pPr>
             <w:r>
               <w:rPr>
@@ -1424,6 +1438,7 @@
             <w:pPr>
               <w:bidi/>
               <w:spacing w:line="240" w:lineRule="auto" w:after="40"/>
+              <w:jc w:val="right"/>
             </w:pPr>
             <w:r>
               <w:rPr>
@@ -1446,6 +1461,7 @@
             <w:pPr>
               <w:bidi/>
               <w:spacing w:line="240" w:lineRule="auto" w:after="40"/>
+              <w:jc w:val="right"/>
             </w:pPr>
             <w:r>
               <w:rPr>
@@ -1470,6 +1486,7 @@
             <w:pPr>
               <w:bidi/>
               <w:spacing w:line="240" w:lineRule="auto" w:after="40"/>
+              <w:jc w:val="right"/>
             </w:pPr>
             <w:r>
               <w:rPr>
@@ -1492,6 +1509,7 @@
             <w:pPr>
               <w:bidi/>
               <w:spacing w:line="240" w:lineRule="auto" w:after="40"/>
+              <w:jc w:val="right"/>
             </w:pPr>
             <w:r>
               <w:rPr>
@@ -1514,6 +1532,7 @@
             <w:pPr>
               <w:bidi/>
               <w:spacing w:line="240" w:lineRule="auto" w:after="40"/>
+              <w:jc w:val="right"/>
             </w:pPr>
             <w:r>
               <w:rPr>
@@ -1536,6 +1555,7 @@
             <w:pPr>
               <w:bidi/>
               <w:spacing w:line="240" w:lineRule="auto" w:after="40"/>
+              <w:jc w:val="right"/>
             </w:pPr>
             <w:r>
               <w:rPr>
@@ -1560,6 +1580,7 @@
             <w:pPr>
               <w:bidi/>
               <w:spacing w:line="240" w:lineRule="auto" w:after="40"/>
+              <w:jc w:val="right"/>
             </w:pPr>
             <w:r>
               <w:rPr>
@@ -1582,6 +1603,7 @@
             <w:pPr>
               <w:bidi/>
               <w:spacing w:line="240" w:lineRule="auto" w:after="40"/>
+              <w:jc w:val="right"/>
             </w:pPr>
             <w:r>
               <w:rPr>
@@ -1604,6 +1626,7 @@
             <w:pPr>
               <w:bidi/>
               <w:spacing w:line="240" w:lineRule="auto" w:after="40"/>
+              <w:jc w:val="right"/>
             </w:pPr>
             <w:r>
               <w:rPr>
@@ -1626,6 +1649,7 @@
             <w:pPr>
               <w:bidi/>
               <w:spacing w:line="240" w:lineRule="auto" w:after="40"/>
+              <w:jc w:val="right"/>
             </w:pPr>
             <w:r>
               <w:rPr>
@@ -1650,6 +1674,7 @@
             <w:pPr>
               <w:bidi/>
               <w:spacing w:line="240" w:lineRule="auto" w:after="40"/>
+              <w:jc w:val="right"/>
             </w:pPr>
             <w:r>
               <w:rPr>
@@ -1672,6 +1697,7 @@
             <w:pPr>
               <w:bidi/>
               <w:spacing w:line="240" w:lineRule="auto" w:after="40"/>
+              <w:jc w:val="right"/>
             </w:pPr>
             <w:r>
               <w:rPr>
@@ -1694,6 +1720,7 @@
             <w:pPr>
               <w:bidi/>
               <w:spacing w:line="240" w:lineRule="auto" w:after="40"/>
+              <w:jc w:val="right"/>
             </w:pPr>
             <w:r>
               <w:rPr>
@@ -1716,6 +1743,7 @@
             <w:pPr>
               <w:bidi/>
               <w:spacing w:line="240" w:lineRule="auto" w:after="40"/>
+              <w:jc w:val="right"/>
             </w:pPr>
             <w:r>
               <w:rPr>
@@ -1740,6 +1768,7 @@
             <w:pPr>
               <w:bidi/>
               <w:spacing w:line="240" w:lineRule="auto" w:after="40"/>
+              <w:jc w:val="right"/>
             </w:pPr>
             <w:r>
               <w:rPr>
@@ -1762,6 +1791,7 @@
             <w:pPr>
               <w:bidi/>
               <w:spacing w:line="240" w:lineRule="auto" w:after="40"/>
+              <w:jc w:val="right"/>
             </w:pPr>
             <w:r>
               <w:rPr>
@@ -1784,6 +1814,7 @@
             <w:pPr>
               <w:bidi/>
               <w:spacing w:line="240" w:lineRule="auto" w:after="40"/>
+              <w:jc w:val="right"/>
             </w:pPr>
             <w:r>
               <w:rPr>
@@ -1806,6 +1837,7 @@
             <w:pPr>
               <w:bidi/>
               <w:spacing w:line="240" w:lineRule="auto" w:after="40"/>
+              <w:jc w:val="right"/>
             </w:pPr>
             <w:r>
               <w:rPr>
@@ -1830,6 +1862,7 @@
             <w:pPr>
               <w:bidi/>
               <w:spacing w:line="240" w:lineRule="auto" w:after="40"/>
+              <w:jc w:val="right"/>
             </w:pPr>
             <w:r>
               <w:rPr>
@@ -1852,6 +1885,7 @@
             <w:pPr>
               <w:bidi/>
               <w:spacing w:line="240" w:lineRule="auto" w:after="40"/>
+              <w:jc w:val="right"/>
             </w:pPr>
             <w:r>
               <w:rPr>
@@ -1874,6 +1908,7 @@
             <w:pPr>
               <w:bidi/>
               <w:spacing w:line="240" w:lineRule="auto" w:after="40"/>
+              <w:jc w:val="right"/>
             </w:pPr>
             <w:r>
               <w:rPr>
@@ -1896,6 +1931,7 @@
             <w:pPr>
               <w:bidi/>
               <w:spacing w:line="240" w:lineRule="auto" w:after="40"/>
+              <w:jc w:val="right"/>
             </w:pPr>
             <w:r>
               <w:rPr>
@@ -1920,6 +1956,7 @@
             <w:pPr>
               <w:bidi/>
               <w:spacing w:line="240" w:lineRule="auto" w:after="40"/>
+              <w:jc w:val="right"/>
             </w:pPr>
             <w:r>
               <w:rPr>
@@ -1942,6 +1979,7 @@
             <w:pPr>
               <w:bidi/>
               <w:spacing w:line="240" w:lineRule="auto" w:after="40"/>
+              <w:jc w:val="right"/>
             </w:pPr>
             <w:r>
               <w:rPr>
@@ -1964,6 +2002,7 @@
             <w:pPr>
               <w:bidi/>
               <w:spacing w:line="240" w:lineRule="auto" w:after="40"/>
+              <w:jc w:val="right"/>
             </w:pPr>
             <w:r>
               <w:rPr>
@@ -1986,6 +2025,7 @@
             <w:pPr>
               <w:bidi/>
               <w:spacing w:line="240" w:lineRule="auto" w:after="40"/>
+              <w:jc w:val="right"/>
             </w:pPr>
             <w:r>
               <w:rPr>
@@ -2010,6 +2050,7 @@
             <w:pPr>
               <w:bidi/>
               <w:spacing w:line="240" w:lineRule="auto" w:after="40"/>
+              <w:jc w:val="right"/>
             </w:pPr>
             <w:r>
               <w:rPr>
@@ -2032,6 +2073,7 @@
             <w:pPr>
               <w:bidi/>
               <w:spacing w:line="240" w:lineRule="auto" w:after="40"/>
+              <w:jc w:val="right"/>
             </w:pPr>
             <w:r>
               <w:rPr>
@@ -2054,6 +2096,7 @@
             <w:pPr>
               <w:bidi/>
               <w:spacing w:line="240" w:lineRule="auto" w:after="40"/>
+              <w:jc w:val="right"/>
             </w:pPr>
             <w:r>
               <w:rPr>
@@ -2076,6 +2119,7 @@
             <w:pPr>
               <w:bidi/>
               <w:spacing w:line="240" w:lineRule="auto" w:after="40"/>
+              <w:jc w:val="right"/>
             </w:pPr>
             <w:r>
               <w:rPr>
@@ -2100,6 +2144,7 @@
             <w:pPr>
               <w:bidi/>
               <w:spacing w:line="240" w:lineRule="auto" w:after="40"/>
+              <w:jc w:val="right"/>
             </w:pPr>
             <w:r>
               <w:rPr>
@@ -2122,6 +2167,7 @@
             <w:pPr>
               <w:bidi/>
               <w:spacing w:line="240" w:lineRule="auto" w:after="40"/>
+              <w:jc w:val="right"/>
             </w:pPr>
             <w:r>
               <w:rPr>
@@ -2144,6 +2190,7 @@
             <w:pPr>
               <w:bidi/>
               <w:spacing w:line="240" w:lineRule="auto" w:after="40"/>
+              <w:jc w:val="right"/>
             </w:pPr>
             <w:r>
               <w:rPr>
@@ -2166,6 +2213,7 @@
             <w:pPr>
               <w:bidi/>
               <w:spacing w:line="240" w:lineRule="auto" w:after="40"/>
+              <w:jc w:val="right"/>
             </w:pPr>
             <w:r>
               <w:rPr>
@@ -2190,6 +2238,7 @@
             <w:pPr>
               <w:bidi/>
               <w:spacing w:line="240" w:lineRule="auto" w:after="40"/>
+              <w:jc w:val="right"/>
             </w:pPr>
             <w:r>
               <w:rPr>
@@ -2212,6 +2261,7 @@
             <w:pPr>
               <w:bidi/>
               <w:spacing w:line="240" w:lineRule="auto" w:after="40"/>
+              <w:jc w:val="right"/>
             </w:pPr>
             <w:r>
               <w:rPr>
@@ -2234,6 +2284,7 @@
             <w:pPr>
               <w:bidi/>
               <w:spacing w:line="240" w:lineRule="auto" w:after="40"/>
+              <w:jc w:val="right"/>
             </w:pPr>
             <w:r>
               <w:rPr>
@@ -2256,6 +2307,7 @@
             <w:pPr>
               <w:bidi/>
               <w:spacing w:line="240" w:lineRule="auto" w:after="40"/>
+              <w:jc w:val="right"/>
             </w:pPr>
             <w:r>
               <w:rPr>
@@ -2280,6 +2332,7 @@
             <w:pPr>
               <w:bidi/>
               <w:spacing w:line="240" w:lineRule="auto" w:after="40"/>
+              <w:jc w:val="right"/>
             </w:pPr>
             <w:r>
               <w:rPr>
@@ -2302,6 +2355,7 @@
             <w:pPr>
               <w:bidi/>
               <w:spacing w:line="240" w:lineRule="auto" w:after="40"/>
+              <w:jc w:val="right"/>
             </w:pPr>
             <w:r>
               <w:rPr>
@@ -2324,6 +2378,7 @@
             <w:pPr>
               <w:bidi/>
               <w:spacing w:line="240" w:lineRule="auto" w:after="40"/>
+              <w:jc w:val="right"/>
             </w:pPr>
             <w:r>
               <w:rPr>
@@ -2346,6 +2401,7 @@
             <w:pPr>
               <w:bidi/>
               <w:spacing w:line="240" w:lineRule="auto" w:after="40"/>
+              <w:jc w:val="right"/>
             </w:pPr>
             <w:r>
               <w:rPr>
@@ -2370,6 +2426,7 @@
             <w:pPr>
               <w:bidi/>
               <w:spacing w:line="240" w:lineRule="auto" w:after="40"/>
+              <w:jc w:val="right"/>
             </w:pPr>
             <w:r>
               <w:rPr>
@@ -2392,6 +2449,7 @@
             <w:pPr>
               <w:bidi/>
               <w:spacing w:line="240" w:lineRule="auto" w:after="40"/>
+              <w:jc w:val="right"/>
             </w:pPr>
             <w:r>
               <w:rPr>
@@ -2414,6 +2472,7 @@
             <w:pPr>
               <w:bidi/>
               <w:spacing w:line="240" w:lineRule="auto" w:after="40"/>
+              <w:jc w:val="right"/>
             </w:pPr>
             <w:r>
               <w:rPr>
@@ -2436,6 +2495,7 @@
             <w:pPr>
               <w:bidi/>
               <w:spacing w:line="240" w:lineRule="auto" w:after="40"/>
+              <w:jc w:val="right"/>
             </w:pPr>
             <w:r>
               <w:rPr>
@@ -2463,14 +2523,15 @@
       <w:pPr>
         <w:pStyle w:val="Heading2"/>
         <w:bidi/>
+        <w:jc w:val="right"/>
       </w:pPr>
       <w:r>
         <w:rPr>
           <w:rFonts w:ascii="Simplified Arabic" w:hAnsi="Simplified Arabic" w:cs="Simplified Arabic" w:eastAsia="Simplified Arabic"/>
           <w:b/>
-          <w:bCs/>
           <w:i w:val="0"/>
           <w:sz w:val="32"/>
+          <w:bCs/>
           <w:szCs w:val="32"/>
           <w:rtl/>
         </w:rPr>
@@ -2504,9 +2565,9 @@
         <w:rPr>
           <w:rFonts w:ascii="Simplified Arabic" w:hAnsi="Simplified Arabic" w:cs="Simplified Arabic" w:eastAsia="Simplified Arabic"/>
           <w:b/>
-          <w:bCs/>
           <w:i w:val="0"/>
           <w:sz w:val="28"/>
+          <w:bCs/>
           <w:szCs w:val="28"/>
           <w:rtl/>
         </w:rPr>
@@ -2534,9 +2595,9 @@
         <w:rPr>
           <w:rFonts w:ascii="Simplified Arabic" w:hAnsi="Simplified Arabic" w:cs="Simplified Arabic" w:eastAsia="Simplified Arabic"/>
           <w:b/>
-          <w:bCs/>
           <w:i w:val="0"/>
           <w:sz w:val="28"/>
+          <w:bCs/>
           <w:szCs w:val="28"/>
           <w:rtl/>
         </w:rPr>
@@ -2564,9 +2625,9 @@
         <w:rPr>
           <w:rFonts w:ascii="Simplified Arabic" w:hAnsi="Simplified Arabic" w:cs="Simplified Arabic" w:eastAsia="Simplified Arabic"/>
           <w:b/>
-          <w:bCs/>
           <w:i w:val="0"/>
           <w:sz w:val="28"/>
+          <w:bCs/>
           <w:szCs w:val="28"/>
           <w:rtl/>
         </w:rPr>
@@ -2594,9 +2655,9 @@
         <w:rPr>
           <w:rFonts w:ascii="Simplified Arabic" w:hAnsi="Simplified Arabic" w:cs="Simplified Arabic" w:eastAsia="Simplified Arabic"/>
           <w:b/>
-          <w:bCs/>
           <w:i w:val="0"/>
           <w:sz w:val="28"/>
+          <w:bCs/>
           <w:szCs w:val="28"/>
           <w:rtl/>
         </w:rPr>
@@ -2624,9 +2685,9 @@
         <w:rPr>
           <w:rFonts w:ascii="Simplified Arabic" w:hAnsi="Simplified Arabic" w:cs="Simplified Arabic" w:eastAsia="Simplified Arabic"/>
           <w:b/>
-          <w:bCs/>
           <w:i w:val="0"/>
           <w:sz w:val="28"/>
+          <w:bCs/>
           <w:szCs w:val="28"/>
           <w:rtl/>
         </w:rPr>
@@ -2650,10 +2711,11 @@
           <w:footerReference w:type="default" r:id="rId11"/>
           <w:pgSz w:w="11906" w:h="16838"/>
           <w:pgMar w:top="1417" w:right="1701" w:bottom="1417" w:left="1134" w:header="720" w:footer="720" w:gutter="0"/>
+          <w:cols w:space="720"/>
+          <w:docGrid w:linePitch="360"/>
+          <w:bidi/>
           <w:pgNumType w:fmt="decimal" w:start="1"/>
-          <w:cols w:space="720"/>
           <w:bidi/>
-          <w:docGrid w:linePitch="360"/>
         </w:sectPr>
       </w:pPr>
     </w:p>
@@ -2723,9 +2785,9 @@
         <w:rPr>
           <w:rFonts w:ascii="Simplified Arabic" w:hAnsi="Simplified Arabic" w:cs="Simplified Arabic" w:eastAsia="Simplified Arabic"/>
           <w:b/>
-          <w:bCs/>
           <w:i w:val="0"/>
           <w:sz w:val="56"/>
+          <w:bCs/>
           <w:szCs w:val="56"/>
           <w:rtl/>
         </w:rPr>
@@ -2738,9 +2800,9 @@
         <w:rPr>
           <w:rFonts w:ascii="Simplified Arabic" w:hAnsi="Simplified Arabic" w:cs="Simplified Arabic" w:eastAsia="Simplified Arabic"/>
           <w:b/>
-          <w:bCs/>
           <w:i w:val="0"/>
           <w:sz w:val="56"/>
+          <w:bCs/>
           <w:szCs w:val="56"/>
           <w:rtl/>
         </w:rPr>
@@ -2756,14 +2818,15 @@
       <w:pPr>
         <w:pStyle w:val="Heading2"/>
         <w:bidi/>
+        <w:jc w:val="right"/>
       </w:pPr>
       <w:r>
         <w:rPr>
           <w:rFonts w:ascii="Simplified Arabic" w:hAnsi="Simplified Arabic" w:cs="Simplified Arabic" w:eastAsia="Simplified Arabic"/>
           <w:b/>
-          <w:bCs/>
           <w:i w:val="0"/>
           <w:sz w:val="32"/>
+          <w:bCs/>
           <w:szCs w:val="32"/>
           <w:rtl/>
         </w:rPr>
@@ -2791,14 +2854,15 @@
       <w:pPr>
         <w:pStyle w:val="Heading2"/>
         <w:bidi/>
+        <w:jc w:val="right"/>
       </w:pPr>
       <w:r>
         <w:rPr>
           <w:rFonts w:ascii="Simplified Arabic" w:hAnsi="Simplified Arabic" w:cs="Simplified Arabic" w:eastAsia="Simplified Arabic"/>
           <w:b/>
-          <w:bCs/>
           <w:i w:val="0"/>
           <w:sz w:val="32"/>
+          <w:bCs/>
           <w:szCs w:val="32"/>
           <w:rtl/>
         </w:rPr>
@@ -2809,14 +2873,15 @@
       <w:pPr>
         <w:pStyle w:val="Heading3"/>
         <w:bidi/>
+        <w:jc w:val="right"/>
       </w:pPr>
       <w:r>
         <w:rPr>
           <w:rFonts w:ascii="Simplified Arabic" w:hAnsi="Simplified Arabic" w:cs="Simplified Arabic" w:eastAsia="Simplified Arabic"/>
           <w:b/>
-          <w:bCs/>
           <w:i w:val="0"/>
           <w:sz w:val="28"/>
+          <w:bCs/>
           <w:szCs w:val="28"/>
           <w:rtl/>
         </w:rPr>
@@ -2867,9 +2932,9 @@
         <w:rPr>
           <w:rFonts w:ascii="Simplified Arabic" w:hAnsi="Simplified Arabic" w:cs="Simplified Arabic" w:eastAsia="Simplified Arabic"/>
           <w:b/>
-          <w:bCs/>
           <w:i w:val="0"/>
           <w:sz w:val="28"/>
+          <w:bCs/>
           <w:szCs w:val="28"/>
           <w:rtl/>
         </w:rPr>
@@ -2897,9 +2962,9 @@
         <w:rPr>
           <w:rFonts w:ascii="Simplified Arabic" w:hAnsi="Simplified Arabic" w:cs="Simplified Arabic" w:eastAsia="Simplified Arabic"/>
           <w:b/>
-          <w:bCs/>
           <w:i w:val="0"/>
           <w:sz w:val="28"/>
+          <w:bCs/>
           <w:szCs w:val="28"/>
           <w:rtl/>
         </w:rPr>
@@ -2927,9 +2992,9 @@
         <w:rPr>
           <w:rFonts w:ascii="Simplified Arabic" w:hAnsi="Simplified Arabic" w:cs="Simplified Arabic" w:eastAsia="Simplified Arabic"/>
           <w:b/>
-          <w:bCs/>
           <w:i w:val="0"/>
           <w:sz w:val="28"/>
+          <w:bCs/>
           <w:szCs w:val="28"/>
           <w:rtl/>
         </w:rPr>
@@ -2968,14 +3033,15 @@
       <w:pPr>
         <w:pStyle w:val="Heading3"/>
         <w:bidi/>
+        <w:jc w:val="right"/>
       </w:pPr>
       <w:r>
         <w:rPr>
           <w:rFonts w:ascii="Simplified Arabic" w:hAnsi="Simplified Arabic" w:cs="Simplified Arabic" w:eastAsia="Simplified Arabic"/>
           <w:b/>
-          <w:bCs/>
           <w:i w:val="0"/>
           <w:sz w:val="28"/>
+          <w:bCs/>
           <w:szCs w:val="28"/>
           <w:rtl/>
         </w:rPr>
@@ -3021,9 +3087,9 @@
         <w:rPr>
           <w:rFonts w:ascii="Simplified Arabic" w:hAnsi="Simplified Arabic" w:cs="Simplified Arabic" w:eastAsia="Simplified Arabic"/>
           <w:b/>
-          <w:bCs/>
           <w:i w:val="0"/>
           <w:sz w:val="28"/>
+          <w:bCs/>
           <w:szCs w:val="28"/>
           <w:rtl/>
         </w:rPr>
@@ -3099,9 +3165,9 @@
         <w:rPr>
           <w:rFonts w:ascii="Simplified Arabic" w:hAnsi="Simplified Arabic" w:cs="Simplified Arabic" w:eastAsia="Simplified Arabic"/>
           <w:b/>
-          <w:bCs/>
           <w:i w:val="0"/>
           <w:sz w:val="28"/>
+          <w:bCs/>
           <w:szCs w:val="28"/>
           <w:rtl/>
         </w:rPr>
@@ -3140,14 +3206,15 @@
       <w:pPr>
         <w:pStyle w:val="Heading3"/>
         <w:bidi/>
+        <w:jc w:val="right"/>
       </w:pPr>
       <w:r>
         <w:rPr>
           <w:rFonts w:ascii="Simplified Arabic" w:hAnsi="Simplified Arabic" w:cs="Simplified Arabic" w:eastAsia="Simplified Arabic"/>
           <w:b/>
-          <w:bCs/>
           <w:i w:val="0"/>
           <w:sz w:val="28"/>
+          <w:bCs/>
           <w:szCs w:val="28"/>
           <w:rtl/>
         </w:rPr>
@@ -3175,14 +3242,15 @@
       <w:pPr>
         <w:pStyle w:val="Heading3"/>
         <w:bidi/>
+        <w:jc w:val="right"/>
       </w:pPr>
       <w:r>
         <w:rPr>
           <w:rFonts w:ascii="Simplified Arabic" w:hAnsi="Simplified Arabic" w:cs="Simplified Arabic" w:eastAsia="Simplified Arabic"/>
           <w:b/>
-          <w:bCs/>
           <w:i w:val="0"/>
           <w:sz w:val="28"/>
+          <w:bCs/>
           <w:szCs w:val="28"/>
           <w:rtl/>
         </w:rPr>
@@ -3244,14 +3312,15 @@
       <w:pPr>
         <w:pStyle w:val="Heading2"/>
         <w:bidi/>
+        <w:jc w:val="right"/>
       </w:pPr>
       <w:r>
         <w:rPr>
           <w:rFonts w:ascii="Simplified Arabic" w:hAnsi="Simplified Arabic" w:cs="Simplified Arabic" w:eastAsia="Simplified Arabic"/>
           <w:b/>
-          <w:bCs/>
           <w:i w:val="0"/>
           <w:sz w:val="32"/>
+          <w:bCs/>
           <w:szCs w:val="32"/>
           <w:rtl/>
         </w:rPr>
@@ -3262,14 +3331,15 @@
       <w:pPr>
         <w:pStyle w:val="Heading3"/>
         <w:bidi/>
+        <w:jc w:val="right"/>
       </w:pPr>
       <w:r>
         <w:rPr>
           <w:rFonts w:ascii="Simplified Arabic" w:hAnsi="Simplified Arabic" w:cs="Simplified Arabic" w:eastAsia="Simplified Arabic"/>
           <w:b/>
-          <w:bCs/>
           <w:i w:val="0"/>
           <w:sz w:val="28"/>
+          <w:bCs/>
           <w:szCs w:val="28"/>
           <w:rtl/>
         </w:rPr>
@@ -3314,14 +3384,15 @@
       <w:pPr>
         <w:pStyle w:val="Heading3"/>
         <w:bidi/>
+        <w:jc w:val="right"/>
       </w:pPr>
       <w:r>
         <w:rPr>
           <w:rFonts w:ascii="Simplified Arabic" w:hAnsi="Simplified Arabic" w:cs="Simplified Arabic" w:eastAsia="Simplified Arabic"/>
           <w:b/>
-          <w:bCs/>
           <w:i w:val="0"/>
           <w:sz w:val="28"/>
+          <w:bCs/>
           <w:szCs w:val="28"/>
           <w:rtl/>
         </w:rPr>
@@ -3349,14 +3420,15 @@
       <w:pPr>
         <w:pStyle w:val="Heading3"/>
         <w:bidi/>
+        <w:jc w:val="right"/>
       </w:pPr>
       <w:r>
         <w:rPr>
           <w:rFonts w:ascii="Simplified Arabic" w:hAnsi="Simplified Arabic" w:cs="Simplified Arabic" w:eastAsia="Simplified Arabic"/>
           <w:b/>
-          <w:bCs/>
           <w:i w:val="0"/>
           <w:sz w:val="28"/>
+          <w:bCs/>
           <w:szCs w:val="28"/>
           <w:rtl/>
         </w:rPr>
@@ -3390,9 +3462,9 @@
         <w:rPr>
           <w:rFonts w:ascii="Simplified Arabic" w:hAnsi="Simplified Arabic" w:cs="Simplified Arabic" w:eastAsia="Simplified Arabic"/>
           <w:b/>
-          <w:bCs/>
           <w:i w:val="0"/>
           <w:sz w:val="28"/>
+          <w:bCs/>
           <w:szCs w:val="28"/>
           <w:rtl/>
         </w:rPr>
@@ -3420,9 +3492,9 @@
         <w:rPr>
           <w:rFonts w:ascii="Simplified Arabic" w:hAnsi="Simplified Arabic" w:cs="Simplified Arabic" w:eastAsia="Simplified Arabic"/>
           <w:b/>
-          <w:bCs/>
           <w:i w:val="0"/>
           <w:sz w:val="28"/>
+          <w:bCs/>
           <w:szCs w:val="28"/>
           <w:rtl/>
         </w:rPr>
@@ -3450,9 +3522,9 @@
         <w:rPr>
           <w:rFonts w:ascii="Simplified Arabic" w:hAnsi="Simplified Arabic" w:cs="Simplified Arabic" w:eastAsia="Simplified Arabic"/>
           <w:b/>
-          <w:bCs/>
           <w:i w:val="0"/>
           <w:sz w:val="28"/>
+          <w:bCs/>
           <w:szCs w:val="28"/>
           <w:rtl/>
         </w:rPr>
@@ -3491,14 +3563,15 @@
       <w:pPr>
         <w:pStyle w:val="Heading3"/>
         <w:bidi/>
+        <w:jc w:val="right"/>
       </w:pPr>
       <w:r>
         <w:rPr>
           <w:rFonts w:ascii="Simplified Arabic" w:hAnsi="Simplified Arabic" w:cs="Simplified Arabic" w:eastAsia="Simplified Arabic"/>
           <w:b/>
-          <w:bCs/>
           <w:i w:val="0"/>
           <w:sz w:val="28"/>
+          <w:bCs/>
           <w:szCs w:val="28"/>
           <w:rtl/>
         </w:rPr>
@@ -3526,14 +3599,15 @@
       <w:pPr>
         <w:pStyle w:val="Heading3"/>
         <w:bidi/>
+        <w:jc w:val="right"/>
       </w:pPr>
       <w:r>
         <w:rPr>
           <w:rFonts w:ascii="Simplified Arabic" w:hAnsi="Simplified Arabic" w:cs="Simplified Arabic" w:eastAsia="Simplified Arabic"/>
           <w:b/>
-          <w:bCs/>
           <w:i w:val="0"/>
           <w:sz w:val="28"/>
+          <w:bCs/>
           <w:szCs w:val="28"/>
           <w:rtl/>
         </w:rPr>
@@ -3601,9 +3675,9 @@
         <w:rPr>
           <w:rFonts w:ascii="Simplified Arabic" w:hAnsi="Simplified Arabic" w:cs="Simplified Arabic" w:eastAsia="Simplified Arabic"/>
           <w:b/>
-          <w:bCs/>
           <w:i w:val="0"/>
           <w:sz w:val="24"/>
+          <w:bCs/>
           <w:szCs w:val="24"/>
           <w:rtl/>
         </w:rPr>
@@ -3613,11 +3687,11 @@
     <w:tbl>
       <w:tblPr>
         <w:tblStyle w:val="TableGrid"/>
-        <w:bidiVisual/>
         <w:tblW w:type="auto" w:w="0"/>
         <w:jc w:val="center"/>
         <w:tblLayout w:type="fixed"/>
         <w:tblLook w:firstColumn="1" w:firstRow="1" w:lastColumn="0" w:lastRow="0" w:noHBand="0" w:noVBand="1" w:val="04A0"/>
+        <w:bidiVisual/>
       </w:tblPr>
       <w:tblGrid>
         <w:gridCol w:w="2268"/>
@@ -3635,6 +3709,7 @@
             <w:pPr>
               <w:bidi/>
               <w:spacing w:line="240" w:lineRule="auto" w:after="40"/>
+              <w:jc w:val="right"/>
             </w:pPr>
             <w:r>
               <w:rPr>
@@ -3658,6 +3733,7 @@
             <w:pPr>
               <w:bidi/>
               <w:spacing w:line="240" w:lineRule="auto" w:after="40"/>
+              <w:jc w:val="right"/>
             </w:pPr>
             <w:r>
               <w:rPr>
@@ -3681,6 +3757,7 @@
             <w:pPr>
               <w:bidi/>
               <w:spacing w:line="240" w:lineRule="auto" w:after="40"/>
+              <w:jc w:val="right"/>
             </w:pPr>
             <w:r>
               <w:rPr>
@@ -3704,6 +3781,7 @@
             <w:pPr>
               <w:bidi/>
               <w:spacing w:line="240" w:lineRule="auto" w:after="40"/>
+              <w:jc w:val="right"/>
             </w:pPr>
             <w:r>
               <w:rPr>
@@ -3728,6 +3806,7 @@
             <w:pPr>
               <w:bidi/>
               <w:spacing w:line="240" w:lineRule="auto" w:after="40"/>
+              <w:jc w:val="right"/>
             </w:pPr>
             <w:r>
               <w:rPr>
@@ -3750,6 +3829,7 @@
             <w:pPr>
               <w:bidi/>
               <w:spacing w:line="240" w:lineRule="auto" w:after="40"/>
+              <w:jc w:val="right"/>
             </w:pPr>
             <w:r>
               <w:rPr>
@@ -3772,6 +3852,7 @@
             <w:pPr>
               <w:bidi/>
               <w:spacing w:line="240" w:lineRule="auto" w:after="40"/>
+              <w:jc w:val="right"/>
             </w:pPr>
             <w:r>
               <w:rPr>
@@ -3794,6 +3875,7 @@
             <w:pPr>
               <w:bidi/>
               <w:spacing w:line="240" w:lineRule="auto" w:after="40"/>
+              <w:jc w:val="right"/>
             </w:pPr>
             <w:r>
               <w:rPr>
@@ -3818,6 +3900,7 @@
             <w:pPr>
               <w:bidi/>
               <w:spacing w:line="240" w:lineRule="auto" w:after="40"/>
+              <w:jc w:val="right"/>
             </w:pPr>
             <w:r>
               <w:rPr>
@@ -3840,6 +3923,7 @@
             <w:pPr>
               <w:bidi/>
               <w:spacing w:line="240" w:lineRule="auto" w:after="40"/>
+              <w:jc w:val="right"/>
             </w:pPr>
             <w:r>
               <w:rPr>
@@ -3862,6 +3946,7 @@
             <w:pPr>
               <w:bidi/>
               <w:spacing w:line="240" w:lineRule="auto" w:after="40"/>
+              <w:jc w:val="right"/>
             </w:pPr>
             <w:r>
               <w:rPr>
@@ -3884,6 +3969,7 @@
             <w:pPr>
               <w:bidi/>
               <w:spacing w:line="240" w:lineRule="auto" w:after="40"/>
+              <w:jc w:val="right"/>
             </w:pPr>
             <w:r>
               <w:rPr>
@@ -3908,6 +3994,7 @@
             <w:pPr>
               <w:bidi/>
               <w:spacing w:line="240" w:lineRule="auto" w:after="40"/>
+              <w:jc w:val="right"/>
             </w:pPr>
             <w:r>
               <w:rPr>
@@ -3930,6 +4017,7 @@
             <w:pPr>
               <w:bidi/>
               <w:spacing w:line="240" w:lineRule="auto" w:after="40"/>
+              <w:jc w:val="right"/>
             </w:pPr>
             <w:r>
               <w:rPr>
@@ -3952,6 +4040,7 @@
             <w:pPr>
               <w:bidi/>
               <w:spacing w:line="240" w:lineRule="auto" w:after="40"/>
+              <w:jc w:val="right"/>
             </w:pPr>
             <w:r>
               <w:rPr>
@@ -3974,6 +4063,7 @@
             <w:pPr>
               <w:bidi/>
               <w:spacing w:line="240" w:lineRule="auto" w:after="40"/>
+              <w:jc w:val="right"/>
             </w:pPr>
             <w:r>
               <w:rPr>
@@ -3998,6 +4088,7 @@
             <w:pPr>
               <w:bidi/>
               <w:spacing w:line="240" w:lineRule="auto" w:after="40"/>
+              <w:jc w:val="right"/>
             </w:pPr>
             <w:r>
               <w:rPr>
@@ -4020,6 +4111,7 @@
             <w:pPr>
               <w:bidi/>
               <w:spacing w:line="240" w:lineRule="auto" w:after="40"/>
+              <w:jc w:val="right"/>
             </w:pPr>
             <w:r>
               <w:rPr>
@@ -4042,6 +4134,7 @@
             <w:pPr>
               <w:bidi/>
               <w:spacing w:line="240" w:lineRule="auto" w:after="40"/>
+              <w:jc w:val="right"/>
             </w:pPr>
             <w:r>
               <w:rPr>
@@ -4064,6 +4157,7 @@
             <w:pPr>
               <w:bidi/>
               <w:spacing w:line="240" w:lineRule="auto" w:after="40"/>
+              <w:jc w:val="right"/>
             </w:pPr>
             <w:r>
               <w:rPr>
@@ -4091,14 +4185,15 @@
       <w:pPr>
         <w:pStyle w:val="Heading2"/>
         <w:bidi/>
+        <w:jc w:val="right"/>
       </w:pPr>
       <w:r>
         <w:rPr>
           <w:rFonts w:ascii="Simplified Arabic" w:hAnsi="Simplified Arabic" w:cs="Simplified Arabic" w:eastAsia="Simplified Arabic"/>
           <w:b/>
-          <w:bCs/>
           <w:i w:val="0"/>
           <w:sz w:val="32"/>
+          <w:bCs/>
           <w:szCs w:val="32"/>
           <w:rtl/>
         </w:rPr>
@@ -4109,14 +4204,15 @@
       <w:pPr>
         <w:pStyle w:val="Heading3"/>
         <w:bidi/>
+        <w:jc w:val="right"/>
       </w:pPr>
       <w:r>
         <w:rPr>
           <w:rFonts w:ascii="Simplified Arabic" w:hAnsi="Simplified Arabic" w:cs="Simplified Arabic" w:eastAsia="Simplified Arabic"/>
           <w:b/>
-          <w:bCs/>
           <w:i w:val="0"/>
           <w:sz w:val="28"/>
+          <w:bCs/>
           <w:szCs w:val="28"/>
           <w:rtl/>
         </w:rPr>
@@ -4144,14 +4240,15 @@
       <w:pPr>
         <w:pStyle w:val="Heading3"/>
         <w:bidi/>
+        <w:jc w:val="right"/>
       </w:pPr>
       <w:r>
         <w:rPr>
           <w:rFonts w:ascii="Simplified Arabic" w:hAnsi="Simplified Arabic" w:cs="Simplified Arabic" w:eastAsia="Simplified Arabic"/>
           <w:b/>
-          <w:bCs/>
           <w:i w:val="0"/>
           <w:sz w:val="28"/>
+          <w:bCs/>
           <w:szCs w:val="28"/>
           <w:rtl/>
         </w:rPr>
@@ -4179,14 +4276,15 @@
       <w:pPr>
         <w:pStyle w:val="Heading3"/>
         <w:bidi/>
+        <w:jc w:val="right"/>
       </w:pPr>
       <w:r>
         <w:rPr>
           <w:rFonts w:ascii="Simplified Arabic" w:hAnsi="Simplified Arabic" w:cs="Simplified Arabic" w:eastAsia="Simplified Arabic"/>
           <w:b/>
-          <w:bCs/>
           <w:i w:val="0"/>
           <w:sz w:val="28"/>
+          <w:bCs/>
           <w:szCs w:val="28"/>
           <w:rtl/>
         </w:rPr>
@@ -4214,14 +4312,15 @@
       <w:pPr>
         <w:pStyle w:val="Heading3"/>
         <w:bidi/>
+        <w:jc w:val="right"/>
       </w:pPr>
       <w:r>
         <w:rPr>
           <w:rFonts w:ascii="Simplified Arabic" w:hAnsi="Simplified Arabic" w:cs="Simplified Arabic" w:eastAsia="Simplified Arabic"/>
           <w:b/>
-          <w:bCs/>
           <w:i w:val="0"/>
           <w:sz w:val="28"/>
+          <w:bCs/>
           <w:szCs w:val="28"/>
           <w:rtl/>
         </w:rPr>
@@ -4249,14 +4348,15 @@
       <w:pPr>
         <w:pStyle w:val="Heading3"/>
         <w:bidi/>
+        <w:jc w:val="right"/>
       </w:pPr>
       <w:r>
         <w:rPr>
           <w:rFonts w:ascii="Simplified Arabic" w:hAnsi="Simplified Arabic" w:cs="Simplified Arabic" w:eastAsia="Simplified Arabic"/>
           <w:b/>
-          <w:bCs/>
           <w:i w:val="0"/>
           <w:sz w:val="28"/>
+          <w:bCs/>
           <w:szCs w:val="28"/>
           <w:rtl/>
         </w:rPr>
@@ -4284,14 +4384,15 @@
       <w:pPr>
         <w:pStyle w:val="Heading3"/>
         <w:bidi/>
+        <w:jc w:val="right"/>
       </w:pPr>
       <w:r>
         <w:rPr>
           <w:rFonts w:ascii="Simplified Arabic" w:hAnsi="Simplified Arabic" w:cs="Simplified Arabic" w:eastAsia="Simplified Arabic"/>
           <w:b/>
-          <w:bCs/>
           <w:i w:val="0"/>
           <w:sz w:val="28"/>
+          <w:bCs/>
           <w:szCs w:val="28"/>
           <w:rtl/>
         </w:rPr>
@@ -4319,14 +4420,15 @@
       <w:pPr>
         <w:pStyle w:val="Heading2"/>
         <w:bidi/>
+        <w:jc w:val="right"/>
       </w:pPr>
       <w:r>
         <w:rPr>
           <w:rFonts w:ascii="Simplified Arabic" w:hAnsi="Simplified Arabic" w:cs="Simplified Arabic" w:eastAsia="Simplified Arabic"/>
           <w:b/>
-          <w:bCs/>
           <w:i w:val="0"/>
           <w:sz w:val="32"/>
+          <w:bCs/>
           <w:szCs w:val="32"/>
           <w:rtl/>
         </w:rPr>
@@ -4337,14 +4439,15 @@
       <w:pPr>
         <w:pStyle w:val="Heading3"/>
         <w:bidi/>
+        <w:jc w:val="right"/>
       </w:pPr>
       <w:r>
         <w:rPr>
           <w:rFonts w:ascii="Simplified Arabic" w:hAnsi="Simplified Arabic" w:cs="Simplified Arabic" w:eastAsia="Simplified Arabic"/>
           <w:b/>
-          <w:bCs/>
           <w:i w:val="0"/>
           <w:sz w:val="28"/>
+          <w:bCs/>
           <w:szCs w:val="28"/>
           <w:rtl/>
         </w:rPr>
@@ -4372,14 +4475,15 @@
       <w:pPr>
         <w:pStyle w:val="Heading3"/>
         <w:bidi/>
+        <w:jc w:val="right"/>
       </w:pPr>
       <w:r>
         <w:rPr>
           <w:rFonts w:ascii="Simplified Arabic" w:hAnsi="Simplified Arabic" w:cs="Simplified Arabic" w:eastAsia="Simplified Arabic"/>
           <w:b/>
-          <w:bCs/>
           <w:i w:val="0"/>
           <w:sz w:val="28"/>
+          <w:bCs/>
           <w:szCs w:val="28"/>
           <w:rtl/>
         </w:rPr>
@@ -4407,14 +4511,15 @@
       <w:pPr>
         <w:pStyle w:val="Heading3"/>
         <w:bidi/>
+        <w:jc w:val="right"/>
       </w:pPr>
       <w:r>
         <w:rPr>
           <w:rFonts w:ascii="Simplified Arabic" w:hAnsi="Simplified Arabic" w:cs="Simplified Arabic" w:eastAsia="Simplified Arabic"/>
           <w:b/>
-          <w:bCs/>
           <w:i w:val="0"/>
           <w:sz w:val="28"/>
+          <w:bCs/>
           <w:szCs w:val="28"/>
           <w:rtl/>
         </w:rPr>
@@ -4442,14 +4547,15 @@
       <w:pPr>
         <w:pStyle w:val="Heading3"/>
         <w:bidi/>
+        <w:jc w:val="right"/>
       </w:pPr>
       <w:r>
         <w:rPr>
           <w:rFonts w:ascii="Simplified Arabic" w:hAnsi="Simplified Arabic" w:cs="Simplified Arabic" w:eastAsia="Simplified Arabic"/>
           <w:b/>
-          <w:bCs/>
           <w:i w:val="0"/>
           <w:sz w:val="28"/>
+          <w:bCs/>
           <w:szCs w:val="28"/>
           <w:rtl/>
         </w:rPr>
@@ -4500,9 +4606,9 @@
         <w:rPr>
           <w:rFonts w:ascii="Simplified Arabic" w:hAnsi="Simplified Arabic" w:cs="Simplified Arabic" w:eastAsia="Simplified Arabic"/>
           <w:b/>
-          <w:bCs/>
           <w:i w:val="0"/>
           <w:sz w:val="24"/>
+          <w:bCs/>
           <w:szCs w:val="24"/>
           <w:rtl/>
         </w:rPr>
@@ -4512,11 +4618,11 @@
     <w:tbl>
       <w:tblPr>
         <w:tblStyle w:val="TableGrid"/>
-        <w:bidiVisual/>
         <w:tblW w:type="auto" w:w="0"/>
         <w:jc w:val="center"/>
         <w:tblLayout w:type="fixed"/>
         <w:tblLook w:firstColumn="1" w:firstRow="1" w:lastColumn="0" w:lastRow="0" w:noHBand="0" w:noVBand="1" w:val="04A0"/>
+        <w:bidiVisual/>
       </w:tblPr>
       <w:tblGrid>
         <w:gridCol w:w="2268"/>
@@ -4534,6 +4640,7 @@
             <w:pPr>
               <w:bidi/>
               <w:spacing w:line="240" w:lineRule="auto" w:after="40"/>
+              <w:jc w:val="right"/>
             </w:pPr>
             <w:r>
               <w:rPr>
@@ -4557,6 +4664,7 @@
             <w:pPr>
               <w:bidi/>
               <w:spacing w:line="240" w:lineRule="auto" w:after="40"/>
+              <w:jc w:val="right"/>
             </w:pPr>
             <w:r>
               <w:rPr>
@@ -4580,6 +4688,7 @@
             <w:pPr>
               <w:bidi/>
               <w:spacing w:line="240" w:lineRule="auto" w:after="40"/>
+              <w:jc w:val="right"/>
             </w:pPr>
             <w:r>
               <w:rPr>
@@ -4603,6 +4712,7 @@
             <w:pPr>
               <w:bidi/>
               <w:spacing w:line="240" w:lineRule="auto" w:after="40"/>
+              <w:jc w:val="right"/>
             </w:pPr>
             <w:r>
               <w:rPr>
@@ -4627,6 +4737,7 @@
             <w:pPr>
               <w:bidi/>
               <w:spacing w:line="240" w:lineRule="auto" w:after="40"/>
+              <w:jc w:val="right"/>
             </w:pPr>
             <w:r>
               <w:rPr>
@@ -4649,6 +4760,7 @@
             <w:pPr>
               <w:bidi/>
               <w:spacing w:line="240" w:lineRule="auto" w:after="40"/>
+              <w:jc w:val="right"/>
             </w:pPr>
             <w:r>
               <w:rPr>
@@ -4671,6 +4783,7 @@
             <w:pPr>
               <w:bidi/>
               <w:spacing w:line="240" w:lineRule="auto" w:after="40"/>
+              <w:jc w:val="right"/>
             </w:pPr>
             <w:r>
               <w:rPr>
@@ -4693,6 +4806,7 @@
             <w:pPr>
               <w:bidi/>
               <w:spacing w:line="240" w:lineRule="auto" w:after="40"/>
+              <w:jc w:val="right"/>
             </w:pPr>
             <w:r>
               <w:rPr>
@@ -4717,6 +4831,7 @@
             <w:pPr>
               <w:bidi/>
               <w:spacing w:line="240" w:lineRule="auto" w:after="40"/>
+              <w:jc w:val="right"/>
             </w:pPr>
             <w:r>
               <w:rPr>
@@ -4739,6 +4854,7 @@
             <w:pPr>
               <w:bidi/>
               <w:spacing w:line="240" w:lineRule="auto" w:after="40"/>
+              <w:jc w:val="right"/>
             </w:pPr>
             <w:r>
               <w:rPr>
@@ -4761,6 +4877,7 @@
             <w:pPr>
               <w:bidi/>
               <w:spacing w:line="240" w:lineRule="auto" w:after="40"/>
+              <w:jc w:val="right"/>
             </w:pPr>
             <w:r>
               <w:rPr>
@@ -4783,6 +4900,7 @@
             <w:pPr>
               <w:bidi/>
               <w:spacing w:line="240" w:lineRule="auto" w:after="40"/>
+              <w:jc w:val="right"/>
             </w:pPr>
             <w:r>
               <w:rPr>
@@ -4807,6 +4925,7 @@
             <w:pPr>
               <w:bidi/>
               <w:spacing w:line="240" w:lineRule="auto" w:after="40"/>
+              <w:jc w:val="right"/>
             </w:pPr>
             <w:r>
               <w:rPr>
@@ -4829,6 +4948,7 @@
             <w:pPr>
               <w:bidi/>
               <w:spacing w:line="240" w:lineRule="auto" w:after="40"/>
+              <w:jc w:val="right"/>
             </w:pPr>
             <w:r>
               <w:rPr>
@@ -4851,6 +4971,7 @@
             <w:pPr>
               <w:bidi/>
               <w:spacing w:line="240" w:lineRule="auto" w:after="40"/>
+              <w:jc w:val="right"/>
             </w:pPr>
             <w:r>
               <w:rPr>
@@ -4873,6 +4994,7 @@
             <w:pPr>
               <w:bidi/>
               <w:spacing w:line="240" w:lineRule="auto" w:after="40"/>
+              <w:jc w:val="right"/>
             </w:pPr>
             <w:r>
               <w:rPr>
@@ -4897,6 +5019,7 @@
             <w:pPr>
               <w:bidi/>
               <w:spacing w:line="240" w:lineRule="auto" w:after="40"/>
+              <w:jc w:val="right"/>
             </w:pPr>
             <w:r>
               <w:rPr>
@@ -4919,6 +5042,7 @@
             <w:pPr>
               <w:bidi/>
               <w:spacing w:line="240" w:lineRule="auto" w:after="40"/>
+              <w:jc w:val="right"/>
             </w:pPr>
             <w:r>
               <w:rPr>
@@ -4941,6 +5065,7 @@
             <w:pPr>
               <w:bidi/>
               <w:spacing w:line="240" w:lineRule="auto" w:after="40"/>
+              <w:jc w:val="right"/>
             </w:pPr>
             <w:r>
               <w:rPr>
@@ -4963,6 +5088,7 @@
             <w:pPr>
               <w:bidi/>
               <w:spacing w:line="240" w:lineRule="auto" w:after="40"/>
+              <w:jc w:val="right"/>
             </w:pPr>
             <w:r>
               <w:rPr>
@@ -4987,6 +5113,7 @@
             <w:pPr>
               <w:bidi/>
               <w:spacing w:line="240" w:lineRule="auto" w:after="40"/>
+              <w:jc w:val="right"/>
             </w:pPr>
             <w:r>
               <w:rPr>
@@ -5009,6 +5136,7 @@
             <w:pPr>
               <w:bidi/>
               <w:spacing w:line="240" w:lineRule="auto" w:after="40"/>
+              <w:jc w:val="right"/>
             </w:pPr>
             <w:r>
               <w:rPr>
@@ -5031,6 +5159,7 @@
             <w:pPr>
               <w:bidi/>
               <w:spacing w:line="240" w:lineRule="auto" w:after="40"/>
+              <w:jc w:val="right"/>
             </w:pPr>
             <w:r>
               <w:rPr>
@@ -5053,6 +5182,7 @@
             <w:pPr>
               <w:bidi/>
               <w:spacing w:line="240" w:lineRule="auto" w:after="40"/>
+              <w:jc w:val="right"/>
             </w:pPr>
             <w:r>
               <w:rPr>
@@ -5080,14 +5210,15 @@
       <w:pPr>
         <w:pStyle w:val="Heading2"/>
         <w:bidi/>
+        <w:jc w:val="right"/>
       </w:pPr>
       <w:r>
         <w:rPr>
           <w:rFonts w:ascii="Simplified Arabic" w:hAnsi="Simplified Arabic" w:cs="Simplified Arabic" w:eastAsia="Simplified Arabic"/>
           <w:b/>
-          <w:bCs/>
           <w:i w:val="0"/>
           <w:sz w:val="32"/>
+          <w:bCs/>
           <w:szCs w:val="32"/>
           <w:rtl/>
         </w:rPr>
@@ -5133,9 +5264,9 @@
         <w:rPr>
           <w:rFonts w:ascii="Simplified Arabic" w:hAnsi="Simplified Arabic" w:cs="Simplified Arabic" w:eastAsia="Simplified Arabic"/>
           <w:b/>
-          <w:bCs/>
           <w:i w:val="0"/>
           <w:sz w:val="28"/>
+          <w:bCs/>
           <w:szCs w:val="28"/>
           <w:rtl/>
         </w:rPr>
@@ -5175,9 +5306,9 @@
         <w:rPr>
           <w:rFonts w:ascii="Simplified Arabic" w:hAnsi="Simplified Arabic" w:cs="Simplified Arabic" w:eastAsia="Simplified Arabic"/>
           <w:b/>
-          <w:bCs/>
           <w:i w:val="0"/>
           <w:sz w:val="28"/>
+          <w:bCs/>
           <w:szCs w:val="28"/>
           <w:rtl/>
         </w:rPr>
@@ -5217,9 +5348,9 @@
         <w:rPr>
           <w:rFonts w:ascii="Simplified Arabic" w:hAnsi="Simplified Arabic" w:cs="Simplified Arabic" w:eastAsia="Simplified Arabic"/>
           <w:b/>
-          <w:bCs/>
           <w:i w:val="0"/>
           <w:sz w:val="28"/>
+          <w:bCs/>
           <w:szCs w:val="28"/>
           <w:rtl/>
         </w:rPr>
@@ -5259,9 +5390,9 @@
         <w:rPr>
           <w:rFonts w:ascii="Simplified Arabic" w:hAnsi="Simplified Arabic" w:cs="Simplified Arabic" w:eastAsia="Simplified Arabic"/>
           <w:b/>
-          <w:bCs/>
           <w:i w:val="0"/>
           <w:sz w:val="28"/>
+          <w:bCs/>
           <w:szCs w:val="28"/>
           <w:rtl/>
         </w:rPr>
@@ -5301,9 +5432,9 @@
         <w:rPr>
           <w:rFonts w:ascii="Simplified Arabic" w:hAnsi="Simplified Arabic" w:cs="Simplified Arabic" w:eastAsia="Simplified Arabic"/>
           <w:b/>
-          <w:bCs/>
           <w:i w:val="0"/>
           <w:sz w:val="28"/>
+          <w:bCs/>
           <w:szCs w:val="28"/>
           <w:rtl/>
         </w:rPr>
@@ -5325,14 +5456,15 @@
       <w:pPr>
         <w:pStyle w:val="Heading2"/>
         <w:bidi/>
+        <w:jc w:val="right"/>
       </w:pPr>
       <w:r>
         <w:rPr>
           <w:rFonts w:ascii="Simplified Arabic" w:hAnsi="Simplified Arabic" w:cs="Simplified Arabic" w:eastAsia="Simplified Arabic"/>
           <w:b/>
-          <w:bCs/>
           <w:i w:val="0"/>
           <w:sz w:val="32"/>
+          <w:bCs/>
           <w:szCs w:val="32"/>
           <w:rtl/>
         </w:rPr>
@@ -5362,10 +5494,12 @@
           <w:footerReference w:type="default" r:id="rId12"/>
           <w:pgSz w:w="11906" w:h="16838"/>
           <w:pgMar w:top="1417" w:right="1701" w:bottom="1417" w:left="1134" w:header="720" w:footer="720" w:gutter="0"/>
+          <w:cols w:space="720"/>
+          <w:docGrid w:linePitch="360"/>
+          <w:bidi/>
+          <w:bidi/>
           <w:pgNumType w:fmt="decimal"/>
-          <w:cols w:space="720"/>
           <w:bidi/>
-          <w:docGrid w:linePitch="360"/>
         </w:sectPr>
       </w:pPr>
     </w:p>
@@ -5373,14 +5507,15 @@
       <w:pPr>
         <w:pStyle w:val="Heading1"/>
         <w:bidi/>
+        <w:jc w:val="right"/>
       </w:pPr>
       <w:r>
         <w:rPr>
           <w:rFonts w:ascii="Simplified Arabic" w:hAnsi="Simplified Arabic" w:cs="Simplified Arabic" w:eastAsia="Simplified Arabic"/>
           <w:b/>
-          <w:bCs/>
           <w:i w:val="0"/>
           <w:sz w:val="40"/>
+          <w:bCs/>
           <w:szCs w:val="40"/>
           <w:rtl/>
         </w:rPr>
@@ -5967,10 +6102,13 @@
       <w:footerReference w:type="default" r:id="rId13"/>
       <w:pgSz w:w="11906" w:h="16838"/>
       <w:pgMar w:top="1417" w:right="1701" w:bottom="1417" w:left="1134" w:header="720" w:footer="720" w:gutter="0"/>
+      <w:cols w:space="720"/>
+      <w:docGrid w:linePitch="360"/>
+      <w:bidi/>
+      <w:bidi/>
+      <w:bidi/>
       <w:pgNumType/>
-      <w:cols w:space="720"/>
       <w:bidi/>
-      <w:docGrid w:linePitch="360"/>
     </w:sectPr>
   </w:body>
 </w:document>
@@ -6119,16 +6257,6 @@
     </w:r>
   </w:p>
 </w:ftr>
-</file>
-
-<file path=word/header1.xml><?xml version="1.0" encoding="utf-8"?>
-<w:hdr xmlns:m="http://schemas.openxmlformats.org/officeDocument/2006/math" xmlns:mc="http://schemas.openxmlformats.org/markup-compatibility/2006" xmlns:mo="http://schemas.microsoft.com/office/mac/office/2008/main" xmlns:mv="urn:schemas-microsoft-com:mac:vml" xmlns:o="urn:schemas-microsoft-com:office:office" xmlns:r="http://schemas.openxmlformats.org/officeDocument/2006/relationships" xmlns:v="urn:schemas-microsoft-com:vml" xmlns:w10="urn:schemas-microsoft-com:office:word" xmlns:w14="http://schemas.microsoft.com/office/word/2010/wordml" xmlns:w="http://schemas.openxmlformats.org/wordprocessingml/2006/main" xmlns:wne="http://schemas.microsoft.com/office/word/2006/wordml" xmlns:wp14="http://schemas.microsoft.com/office/word/2010/wordprocessingDrawing" xmlns:wp="http://schemas.openxmlformats.org/drawingml/2006/wordprocessingDrawing" xmlns:wpc="http://schemas.microsoft.com/office/word/2010/wordprocessingCanvas" xmlns:wpg="http://schemas.microsoft.com/office/word/2010/wordprocessingGroup" xmlns:wpi="http://schemas.microsoft.com/office/word/2010/wordprocessingInk" xmlns:wps="http://schemas.microsoft.com/office/word/2010/wordprocessingShape" mc:Ignorable="w14 wp14">
-  <w:p>
-    <w:pPr>
-      <w:pStyle w:val="Header"/>
-    </w:pPr>
-  </w:p>
-</w:hdr>
 </file>
 
 <file path=word/numbering.xml><?xml version="1.0" encoding="utf-8"?>
@@ -6562,11 +6690,14 @@
       <w:outlineLvl w:val="0"/>
     </w:pPr>
     <w:rPr>
-      <w:rFonts w:ascii="Simplified Arabic" w:hAnsi="Simplified Arabic" w:cs="Simplified Arabic" w:eastAsia="Simplified Arabic"/>
+      <w:rFonts w:asciiTheme="majorHAnsi" w:eastAsiaTheme="majorEastAsia" w:hAnsiTheme="majorHAnsi" w:cstheme="majorBidi" w:ascii="Simplified Arabic" w:hAnsi="Simplified Arabic"/>
       <w:b/>
       <w:bCs/>
       <w:color w:val="000000"/>
       <w:sz w:val="40"/>
+      <w:szCs w:val="28"/>
+      <w:rFonts w:ascii="Simplified Arabic" w:hAnsi="Simplified Arabic" w:cs="Simplified Arabic" w:eastAsia="Simplified Arabic"/>
+      <w:bCs/>
       <w:szCs w:val="40"/>
     </w:rPr>
   </w:style>
@@ -6586,11 +6717,14 @@
       <w:outlineLvl w:val="1"/>
     </w:pPr>
     <w:rPr>
-      <w:rFonts w:ascii="Simplified Arabic" w:hAnsi="Simplified Arabic" w:cs="Simplified Arabic" w:eastAsia="Simplified Arabic"/>
+      <w:rFonts w:asciiTheme="majorHAnsi" w:eastAsiaTheme="majorEastAsia" w:hAnsiTheme="majorHAnsi" w:cstheme="majorBidi" w:ascii="Simplified Arabic" w:hAnsi="Simplified Arabic"/>
       <w:b/>
       <w:bCs/>
       <w:color w:val="000000"/>
       <w:sz w:val="32"/>
+      <w:szCs w:val="26"/>
+      <w:rFonts w:ascii="Simplified Arabic" w:hAnsi="Simplified Arabic" w:cs="Simplified Arabic" w:eastAsia="Simplified Arabic"/>
+      <w:bCs/>
       <w:szCs w:val="32"/>
     </w:rPr>
   </w:style>
@@ -6610,11 +6744,13 @@
       <w:outlineLvl w:val="2"/>
     </w:pPr>
     <w:rPr>
-      <w:rFonts w:ascii="Simplified Arabic" w:hAnsi="Simplified Arabic" w:cs="Simplified Arabic" w:eastAsia="Simplified Arabic"/>
+      <w:rFonts w:asciiTheme="majorHAnsi" w:eastAsiaTheme="majorEastAsia" w:hAnsiTheme="majorHAnsi" w:cstheme="majorBidi" w:ascii="Simplified Arabic" w:hAnsi="Simplified Arabic"/>
       <w:b/>
       <w:bCs/>
       <w:color w:val="000000"/>
       <w:sz w:val="28"/>
+      <w:rFonts w:ascii="Simplified Arabic" w:hAnsi="Simplified Arabic" w:cs="Simplified Arabic" w:eastAsia="Simplified Arabic"/>
+      <w:bCs/>
       <w:szCs w:val="28"/>
     </w:rPr>
   </w:style>

</xml_diff>